<commit_message>
docs: productization plan progress log for phase 2
Authored-by: Amit Sarkar
</commit_message>
<xml_diff>
--- a/Techdocumentation/Ramanujans-Interface-Productization-Plan-2026-10-07.docx
+++ b/Techdocumentation/Ramanujans-Interface-Productization-Plan-2026-10-07.docx
@@ -408,7 +408,7 @@
                 <w:b w:val="0"/>
                 <w:sz w:val="18"/>
               </w:rPr>
-              <w:t>2 Site patterns and tokens</w:t>
+              <w:t>2 Site patterns and tokens. DONE 2026-10-08</w:t>
             </w:r>
           </w:p>
         </w:tc>
@@ -427,7 +427,7 @@
                 <w:b w:val="0"/>
                 <w:sz w:val="18"/>
               </w:rPr>
-              <w:t>2026-10-15 to 10-28</w:t>
+              <w:t>2026-10-08</w:t>
             </w:r>
           </w:p>
         </w:tc>
@@ -446,7 +446,7 @@
                 <w:b w:val="0"/>
                 <w:sz w:val="18"/>
               </w:rPr>
-              <w:t>Design-token library from the December 2025 token specification to CSS variables; register the site patterns: image, heading and text block, navigation bar, hero, feature grid, footer, contact form, call-to-action band, testimonial, FAQ; static-site build path; HTML and CSS emitter started (decision F-2)</w:t>
+              <w:t>Design-token library from the December 2025 token specification to CSS variables; the ten site patterns registered (image, text block, navigation bar, hero, feature grid, footer, contact form, call-to-action band, testimonial, FAQ) plus the page layout; static target with no component framework; shell and pre-render so a site is plain HTML and CSS with no script</w:t>
             </w:r>
           </w:p>
         </w:tc>
@@ -465,7 +465,7 @@
                 <w:b w:val="0"/>
                 <w:sz w:val="18"/>
               </w:rPr>
-              <w:t>Ten patterns registered, each with an accessibility check and a render test</w:t>
+              <w:t>Met: ten patterns with render and accessibility checks; sample site builds to 3.5 KB of HTML and 6 KB of CSS; a second build is byte-identical; 14 tests green; pattern library 1.1.0</w:t>
             </w:r>
           </w:p>
         </w:tc>
@@ -1186,7 +1186,7 @@
                 <w:b w:val="0"/>
                 <w:sz w:val="18"/>
               </w:rPr>
-              <w:t>Static build of the existing React output now (fastest, reuses the engine); the HTML and CSS emitter next, for the lighter pages Rs-scale needs</w:t>
+              <w:t>IMPLEMENTED 2026-10-08 as a pre-rendered static build: the hosted output is plain HTML and CSS, no script. A dedicated emitter is deferred until page weight demands it</w:t>
             </w:r>
           </w:p>
         </w:tc>
@@ -1403,7 +1403,7 @@
                 <w:b w:val="0"/>
                 <w:sz w:val="18"/>
               </w:rPr>
-              <w:t>Push the phase 1 commit to the private repository</w:t>
+              <w:t>Push to the private repository</w:t>
             </w:r>
           </w:p>
         </w:tc>
@@ -1422,7 +1422,7 @@
                 <w:b w:val="0"/>
                 <w:sz w:val="18"/>
               </w:rPr>
-              <w:t>Yes, now; the key on the founder's machine is used, nothing is displayed</w:t>
+              <w:t>Phase 1 pushed 2026-10-08 (16c3699). Phase 2 committed locally, push on the founder's word</w:t>
             </w:r>
           </w:p>
         </w:tc>
@@ -1869,7 +1869,47 @@
                 <w:b w:val="0"/>
                 <w:sz w:val="18"/>
               </w:rPr>
-              <w:t>F-1 decided: the innovation movement site on inovations.techinnovations.io; company site unchanged. Phase 1 complete: engine imported into engine/, determinism steps 1 to 5 done, six golden tests green, pattern library 1.0.0, local commit 16c3699. Master to-do steps 1 to 5 ticked. Next: F-6 to F-9, then phase 2 (design tokens and the ten site patterns), which does not wait on them.</w:t>
+              <w:t>F-1 decided: the innovation movement site on inovations.techinnovations.io; company site unchanged. Phase 1 complete: engine imported into engine/, determinism steps 1 to 5 done, six golden tests green, pattern library 1.0.0, local commit 16c3699. Master to-do steps 1 to 5 ticked.</w:t>
+            </w:r>
+          </w:p>
+        </w:tc>
+      </w:tr>
+      <w:tr>
+        <w:tc>
+          <w:tcPr>
+            <w:tcW w:type="dxa" w:w="1440"/>
+          </w:tcPr>
+          <w:p>
+            <w:pPr>
+              <w:spacing w:after="0"/>
+            </w:pPr>
+            <w:r/>
+            <w:r>
+              <w:rPr>
+                <w:rFonts w:ascii="Arial" w:hAnsi="Arial"/>
+                <w:b w:val="0"/>
+                <w:sz w:val="18"/>
+              </w:rPr>
+              <w:t>2026-10-08</w:t>
+            </w:r>
+          </w:p>
+        </w:tc>
+        <w:tc>
+          <w:tcPr>
+            <w:tcW w:type="dxa" w:w="7920"/>
+          </w:tcPr>
+          <w:p>
+            <w:pPr>
+              <w:spacing w:after="0"/>
+            </w:pPr>
+            <w:r/>
+            <w:r>
+              <w:rPr>
+                <w:rFonts w:ascii="Arial" w:hAnsi="Arial"/>
+                <w:b w:val="0"/>
+                <w:sz w:val="18"/>
+              </w:rPr>
+              <w:t>Phase 1 pushed. Phase 2 complete the same day: ten site patterns and the page layout registered without touching the core, design tokens to CSS variables, static target, shell with pre-render; the sample site is plain HTML and CSS and rebuilds byte-identical; 14 tests green; pattern library 1.1.0; committed locally. Open: F-7 domain spelling and hosted zone, F-8 AWS rights, F-9 content inputs. Next: phase 3, the movement site, as soon as F-9 arrives.</w:t>
             </w:r>
           </w:p>
         </w:tc>

</xml_diff>

<commit_message>
docs: plan progress log, gates gear
Authored-by: Amit Sarkar
</commit_message>
<xml_diff>
--- a/Techdocumentation/Ramanujans-Interface-Productization-Plan-2026-10-07.docx
+++ b/Techdocumentation/Ramanujans-Interface-Productization-Plan-2026-10-07.docx
@@ -1914,6 +1914,46 @@
           </w:p>
         </w:tc>
       </w:tr>
+      <w:tr>
+        <w:tc>
+          <w:tcPr>
+            <w:tcW w:type="dxa" w:w="1440"/>
+          </w:tcPr>
+          <w:p>
+            <w:pPr>
+              <w:spacing w:after="0"/>
+            </w:pPr>
+            <w:r/>
+            <w:r>
+              <w:rPr>
+                <w:rFonts w:ascii="Arial" w:hAnsi="Arial"/>
+                <w:b w:val="0"/>
+                <w:sz w:val="18"/>
+              </w:rPr>
+              <w:t>2026-10-08</w:t>
+            </w:r>
+          </w:p>
+        </w:tc>
+        <w:tc>
+          <w:tcPr>
+            <w:tcW w:type="dxa" w:w="7920"/>
+          </w:tcPr>
+          <w:p>
+            <w:pPr>
+              <w:spacing w:after="0"/>
+            </w:pPr>
+            <w:r/>
+            <w:r>
+              <w:rPr>
+                <w:rFonts w:ascii="Arial" w:hAnsi="Arial"/>
+                <w:b w:val="0"/>
+                <w:sz w:val="18"/>
+              </w:rPr>
+              <w:t>Master to-do sections 1 and 1a continued: the determinism gate (step 6) with andon stop, the quality gates (accessibility and size budget on built output), the preview capture with true phone emulation and visual diff, and the local artifact cache (step 7, local tier). The sample site passes every gate: 3.5 KB of HTML, 6.3 KB of CSS, no script, identical on rebuild; phone and desktop captures reviewed. Pushed. Open in list order: ingest (section 2), agents (4), API (5), hosting (6, needs F-7 and F-8).</w:t>
+            </w:r>
+          </w:p>
+        </w:tc>
+      </w:tr>
     </w:tbl>
     <w:p>
       <w:pPr>

</xml_diff>

<commit_message>
docs: plan progress log, library repository
Authored-by: Amit Sarkar
</commit_message>
<xml_diff>
--- a/Techdocumentation/Ramanujans-Interface-Productization-Plan-2026-10-07.docx
+++ b/Techdocumentation/Ramanujans-Interface-Productization-Plan-2026-10-07.docx
@@ -1954,6 +1954,46 @@
           </w:p>
         </w:tc>
       </w:tr>
+      <w:tr>
+        <w:tc>
+          <w:tcPr>
+            <w:tcW w:type="dxa" w:w="1440"/>
+          </w:tcPr>
+          <w:p>
+            <w:pPr>
+              <w:spacing w:after="0"/>
+            </w:pPr>
+            <w:r/>
+            <w:r>
+              <w:rPr>
+                <w:rFonts w:ascii="Arial" w:hAnsi="Arial"/>
+                <w:b w:val="0"/>
+                <w:sz w:val="18"/>
+              </w:rPr>
+              <w:t>2026-10-08</w:t>
+            </w:r>
+          </w:p>
+        </w:tc>
+        <w:tc>
+          <w:tcPr>
+            <w:tcW w:type="dxa" w:w="7920"/>
+          </w:tcPr>
+          <w:p>
+            <w:pPr>
+              <w:spacing w:after="0"/>
+            </w:pPr>
+            <w:r/>
+            <w:r>
+              <w:rPr>
+                <w:rFonts w:ascii="Arial" w:hAnsi="Arial"/>
+                <w:b w:val="0"/>
+                <w:sz w:val="18"/>
+              </w:rPr>
+              <w:t>Ruling: an exhaustive, black-box library repository in the private repository, never shared, pulled by the engine host through the pipeline; deterministic generation only. Built the same evening: catalogs from the installed packages (453 entries, 182 core) on the 58-slot taxonomy; packs for Amplify UI, Next.js, Material Web, Firebase and React Native with Expo (69 generators, 96 registered patterns); patterns now declare imports, handler bodies, effects and module code; six targets with golden samples; unknown types refused; CI gate on push. Pattern library 1.2.0. Pushed.</w:t>
+            </w:r>
+          </w:p>
+        </w:tc>
+      </w:tr>
     </w:tbl>
     <w:p>
       <w:pPr>

</xml_diff>